<commit_message>
Longhand set: boxes only on the example, two pages, compact header with room for name/date/period
Co-Authored-By: Claude Sonnet 5.5 <noreply@anthropic.com>
Claude-Session: https://claude.ai/code/session_01LaT1EarAMnh5opQoFahNzN
</commit_message>
<xml_diff>
--- a/output/chem-u02/SHULL_CHEM_Activity_U02_S02.3_Electron_Battleship.docx
+++ b/output/chem-u02/SHULL_CHEM_Activity_U02_S02.3_Electron_Battleship.docx
@@ -30,7 +30,7 @@
                 <w:rFonts w:ascii="Trade Gothic Next" w:hAnsi="Trade Gothic Next"/>
                 <w:b/>
                 <w:color w:val="4D730E"/>
-                <w:sz w:val="15"/>
+                <w:sz w:val="14"/>
                 <w:spacing w:val="26"/>
               </w:rPr>
               <w:t>SHULL SCIENCE  ·  JAMES A. GARFIELD LOCAL SCHOOLS</w:t>
@@ -45,7 +45,7 @@
                 <w:rFonts w:ascii="Trade Gothic Next" w:hAnsi="Trade Gothic Next"/>
                 <w:b/>
                 <w:color w:val="14161B"/>
-                <w:sz w:val="36"/>
+                <w:sz w:val="26"/>
               </w:rPr>
               <w:t>ELECTRON BATTLESHIP</w:t>
             </w:r>
@@ -59,7 +59,7 @@
                 <w:rFonts w:ascii="Trade Gothic Next" w:hAnsi="Trade Gothic Next"/>
                 <w:b w:val="0"/>
                 <w:color w:val="55604F"/>
-                <w:sz w:val="15"/>
+                <w:sz w:val="14"/>
                 <w:spacing w:val="26"/>
               </w:rPr>
               <w:t>ACTIVITY  ·  ELECTRON CONFIGURATIONS  ·  TWO PLAYERS</w:t>
@@ -71,37 +71,107 @@
     <w:tbl>
       <w:tblPr>
         <w:tblW w:type="auto" w:w="0"/>
-        <w:jc w:val="left"/>
         <w:tblLayout w:type="fixed"/>
         <w:tblLook w:firstColumn="1" w:firstRow="1" w:lastColumn="0" w:lastRow="0" w:noHBand="0" w:noVBand="1" w:val="04A0"/>
         <w:tblLayout w:type="fixed"/>
       </w:tblPr>
       <w:tblGrid>
-        <w:gridCol w:w="10800"/>
+        <w:gridCol w:w="6912"/>
+        <w:gridCol w:w="2160"/>
+        <w:gridCol w:w="1728"/>
       </w:tblGrid>
       <w:tr>
+        <w:trPr>
+          <w:cantSplit/>
+          <w:trHeight w:val="662" w:hRule="atLeast"/>
+        </w:trPr>
         <w:tc>
           <w:tcPr>
-            <w:tcW w:type="dxa" w:w="10800"/>
+            <w:tcW w:type="dxa" w:w="6912"/>
+            <w:vAlign w:val="top"/>
+            <w:tcMar>
+              <w:top w:w="20" w:type="dxa"/>
+              <w:left w:w="0" w:type="dxa"/>
+              <w:bottom w:w="0" w:type="dxa"/>
+              <w:right w:w="120" w:type="dxa"/>
+            </w:tcMar>
             <w:tcBorders>
-              <w:top w:val="single" w:sz="6" w:color="C8CDC2"/>
-              <w:left w:val="single" w:sz="6" w:color="C8CDC2"/>
-              <w:bottom w:val="single" w:sz="6" w:color="C8CDC2"/>
-              <w:right w:val="single" w:sz="6" w:color="C8CDC2"/>
+              <w:bottom w:val="single" w:sz="8" w:color="C8CDC2"/>
             </w:tcBorders>
           </w:tcPr>
           <w:p>
             <w:pPr>
-              <w:spacing w:after="40" w:before="0"/>
-            </w:pPr>
-            <w:r>
-              <w:rPr>
-                <w:rFonts w:ascii="Trade Gothic Next" w:hAnsi="Trade Gothic Next"/>
-                <w:b w:val="0"/>
+              <w:spacing w:after="0"/>
+            </w:pPr>
+            <w:r>
+              <w:rPr>
+                <w:rFonts w:ascii="Trade Gothic Next" w:hAnsi="Trade Gothic Next"/>
+                <w:b/>
                 <w:color w:val="55604F"/>
-                <w:sz w:val="18"/>
-              </w:rPr>
-              <w:t>NAME  ______________________________________   DATE  ______________   PERIOD  _______</w:t>
+                <w:sz w:val="15"/>
+                <w:u w:val="none"/>
+              </w:rPr>
+              <w:t>NAME</w:t>
+            </w:r>
+          </w:p>
+        </w:tc>
+        <w:tc>
+          <w:tcPr>
+            <w:tcW w:type="dxa" w:w="2160"/>
+            <w:vAlign w:val="top"/>
+            <w:tcMar>
+              <w:top w:w="20" w:type="dxa"/>
+              <w:left w:w="0" w:type="dxa"/>
+              <w:bottom w:w="0" w:type="dxa"/>
+              <w:right w:w="120" w:type="dxa"/>
+            </w:tcMar>
+            <w:tcBorders>
+              <w:bottom w:val="single" w:sz="8" w:color="C8CDC2"/>
+            </w:tcBorders>
+          </w:tcPr>
+          <w:p>
+            <w:pPr>
+              <w:spacing w:after="0"/>
+            </w:pPr>
+            <w:r>
+              <w:rPr>
+                <w:rFonts w:ascii="Trade Gothic Next" w:hAnsi="Trade Gothic Next"/>
+                <w:b/>
+                <w:color w:val="55604F"/>
+                <w:sz w:val="15"/>
+                <w:u w:val="none"/>
+              </w:rPr>
+              <w:t>DATE</w:t>
+            </w:r>
+          </w:p>
+        </w:tc>
+        <w:tc>
+          <w:tcPr>
+            <w:tcW w:type="dxa" w:w="1728"/>
+            <w:vAlign w:val="top"/>
+            <w:tcMar>
+              <w:top w:w="20" w:type="dxa"/>
+              <w:left w:w="0" w:type="dxa"/>
+              <w:bottom w:w="0" w:type="dxa"/>
+              <w:right w:w="120" w:type="dxa"/>
+            </w:tcMar>
+            <w:tcBorders>
+              <w:bottom w:val="single" w:sz="8" w:color="C8CDC2"/>
+            </w:tcBorders>
+          </w:tcPr>
+          <w:p>
+            <w:pPr>
+              <w:spacing w:after="0"/>
+            </w:pPr>
+            <w:r>
+              <w:rPr>
+                <w:rFonts w:ascii="Trade Gothic Next" w:hAnsi="Trade Gothic Next"/>
+                <w:b/>
+                <w:color w:val="55604F"/>
+                <w:sz w:val="15"/>
+                <w:u w:val="none"/>
+              </w:rPr>
+              <w:t>PERIOD</w:t>
             </w:r>
           </w:p>
         </w:tc>

</xml_diff>

<commit_message>
Fix periodic table layout: Ne and Ar were missing and B and Al sat in group 14
Affected the Battleship back page and the valence table's blank periodic table. Log the V1 trash plan.

Co-Authored-By: Claude Sonnet 5.5 <noreply@anthropic.com>
Claude-Session: https://claude.ai/code/session_01LaT1EarAMnh5opQoFahNzN
</commit_message>
<xml_diff>
--- a/output/chem-u02/SHULL_CHEM_Activity_U02_S02.3_Electron_Battleship.docx
+++ b/output/chem-u02/SHULL_CHEM_Activity_U02_S02.3_Electron_Battleship.docx
@@ -1268,8 +1268,51 @@
         <w:tc>
           <w:tcPr>
             <w:tcW w:type="dxa" w:w="600"/>
+            <w:tcMar>
+              <w:top w:w="10" w:type="dxa"/>
+              <w:left w:w="20" w:type="dxa"/>
+              <w:bottom w:w="0" w:type="dxa"/>
+              <w:right w:w="0" w:type="dxa"/>
+            </w:tcMar>
+            <w:tcBorders>
+              <w:top w:val="single" w:sz="6" w:color="C8CDC2"/>
+              <w:left w:val="single" w:sz="6" w:color="C8CDC2"/>
+              <w:bottom w:val="single" w:sz="6" w:color="C8CDC2"/>
+              <w:right w:val="single" w:sz="6" w:color="C8CDC2"/>
+            </w:tcBorders>
+            <w:vAlign w:val="top"/>
           </w:tcPr>
-          <w:p/>
+          <w:p>
+            <w:pPr>
+              <w:spacing w:after="0"/>
+            </w:pPr>
+            <w:r>
+              <w:rPr>
+                <w:rFonts w:ascii="Trade Gothic Next" w:hAnsi="Trade Gothic Next"/>
+                <w:b w:val="0"/>
+                <w:color w:val="55604F"/>
+                <w:sz w:val="16"/>
+                <w:u w:val="none"/>
+              </w:rPr>
+              <w:t>5</w:t>
+            </w:r>
+          </w:p>
+          <w:p>
+            <w:pPr>
+              <w:spacing w:after="0"/>
+              <w:jc w:val="center"/>
+            </w:pPr>
+            <w:r>
+              <w:rPr>
+                <w:rFonts w:ascii="Trade Gothic Next" w:hAnsi="Trade Gothic Next"/>
+                <w:b/>
+                <w:color w:val="14161B"/>
+                <w:sz w:val="18"/>
+                <w:u w:val="none"/>
+              </w:rPr>
+              <w:t>B</w:t>
+            </w:r>
+          </w:p>
         </w:tc>
         <w:tc>
           <w:tcPr>
@@ -1300,7 +1343,7 @@
                 <w:sz w:val="16"/>
                 <w:u w:val="none"/>
               </w:rPr>
-              <w:t>5</w:t>
+              <w:t>6</w:t>
             </w:r>
           </w:p>
           <w:p>
@@ -1316,7 +1359,7 @@
                 <w:sz w:val="18"/>
                 <w:u w:val="none"/>
               </w:rPr>
-              <w:t>B</w:t>
+              <w:t>C</w:t>
             </w:r>
           </w:p>
         </w:tc>
@@ -1349,7 +1392,7 @@
                 <w:sz w:val="16"/>
                 <w:u w:val="none"/>
               </w:rPr>
-              <w:t>6</w:t>
+              <w:t>7</w:t>
             </w:r>
           </w:p>
           <w:p>
@@ -1365,7 +1408,7 @@
                 <w:sz w:val="18"/>
                 <w:u w:val="none"/>
               </w:rPr>
-              <w:t>C</w:t>
+              <w:t>N</w:t>
             </w:r>
           </w:p>
         </w:tc>
@@ -1398,7 +1441,7 @@
                 <w:sz w:val="16"/>
                 <w:u w:val="none"/>
               </w:rPr>
-              <w:t>7</w:t>
+              <w:t>8</w:t>
             </w:r>
           </w:p>
           <w:p>
@@ -1414,7 +1457,7 @@
                 <w:sz w:val="18"/>
                 <w:u w:val="none"/>
               </w:rPr>
-              <w:t>N</w:t>
+              <w:t>O</w:t>
             </w:r>
           </w:p>
         </w:tc>
@@ -1447,7 +1490,7 @@
                 <w:sz w:val="16"/>
                 <w:u w:val="none"/>
               </w:rPr>
-              <w:t>8</w:t>
+              <w:t>9</w:t>
             </w:r>
           </w:p>
           <w:p>
@@ -1463,7 +1506,7 @@
                 <w:sz w:val="18"/>
                 <w:u w:val="none"/>
               </w:rPr>
-              <w:t>O</w:t>
+              <w:t>F</w:t>
             </w:r>
           </w:p>
         </w:tc>
@@ -1496,7 +1539,7 @@
                 <w:sz w:val="16"/>
                 <w:u w:val="none"/>
               </w:rPr>
-              <w:t>9</w:t>
+              <w:t>10</w:t>
             </w:r>
           </w:p>
           <w:p>
@@ -1512,7 +1555,7 @@
                 <w:sz w:val="18"/>
                 <w:u w:val="none"/>
               </w:rPr>
-              <w:t>F</w:t>
+              <w:t>Ne</w:t>
             </w:r>
           </w:p>
         </w:tc>
@@ -1619,12 +1662,6 @@
               <w:t>Mg</w:t>
             </w:r>
           </w:p>
-        </w:tc>
-        <w:tc>
-          <w:tcPr>
-            <w:tcW w:type="dxa" w:w="600"/>
-          </w:tcPr>
-          <w:p/>
         </w:tc>
         <w:tc>
           <w:tcPr>
@@ -1928,6 +1965,55 @@
                 <w:u w:val="none"/>
               </w:rPr>
               <w:t>Cl</w:t>
+            </w:r>
+          </w:p>
+        </w:tc>
+        <w:tc>
+          <w:tcPr>
+            <w:tcW w:type="dxa" w:w="600"/>
+            <w:tcMar>
+              <w:top w:w="10" w:type="dxa"/>
+              <w:left w:w="20" w:type="dxa"/>
+              <w:bottom w:w="0" w:type="dxa"/>
+              <w:right w:w="0" w:type="dxa"/>
+            </w:tcMar>
+            <w:tcBorders>
+              <w:top w:val="single" w:sz="6" w:color="C8CDC2"/>
+              <w:left w:val="single" w:sz="6" w:color="C8CDC2"/>
+              <w:bottom w:val="single" w:sz="6" w:color="C8CDC2"/>
+              <w:right w:val="single" w:sz="6" w:color="C8CDC2"/>
+            </w:tcBorders>
+            <w:vAlign w:val="top"/>
+          </w:tcPr>
+          <w:p>
+            <w:pPr>
+              <w:spacing w:after="0"/>
+            </w:pPr>
+            <w:r>
+              <w:rPr>
+                <w:rFonts w:ascii="Trade Gothic Next" w:hAnsi="Trade Gothic Next"/>
+                <w:b w:val="0"/>
+                <w:color w:val="55604F"/>
+                <w:sz w:val="16"/>
+                <w:u w:val="none"/>
+              </w:rPr>
+              <w:t>18</w:t>
+            </w:r>
+          </w:p>
+          <w:p>
+            <w:pPr>
+              <w:spacing w:after="0"/>
+              <w:jc w:val="center"/>
+            </w:pPr>
+            <w:r>
+              <w:rPr>
+                <w:rFonts w:ascii="Trade Gothic Next" w:hAnsi="Trade Gothic Next"/>
+                <w:b/>
+                <w:color w:val="14161B"/>
+                <w:sz w:val="18"/>
+                <w:u w:val="none"/>
+              </w:rPr>
+              <w:t>Ar</w:t>
             </w:r>
           </w:p>
         </w:tc>
@@ -7382,8 +7468,51 @@
         <w:tc>
           <w:tcPr>
             <w:tcW w:type="dxa" w:w="600"/>
+            <w:tcMar>
+              <w:top w:w="10" w:type="dxa"/>
+              <w:left w:w="20" w:type="dxa"/>
+              <w:bottom w:w="0" w:type="dxa"/>
+              <w:right w:w="0" w:type="dxa"/>
+            </w:tcMar>
+            <w:tcBorders>
+              <w:top w:val="single" w:sz="6" w:color="C8CDC2"/>
+              <w:left w:val="single" w:sz="6" w:color="C8CDC2"/>
+              <w:bottom w:val="single" w:sz="6" w:color="C8CDC2"/>
+              <w:right w:val="single" w:sz="6" w:color="C8CDC2"/>
+            </w:tcBorders>
+            <w:vAlign w:val="top"/>
           </w:tcPr>
-          <w:p/>
+          <w:p>
+            <w:pPr>
+              <w:spacing w:after="0"/>
+            </w:pPr>
+            <w:r>
+              <w:rPr>
+                <w:rFonts w:ascii="Trade Gothic Next" w:hAnsi="Trade Gothic Next"/>
+                <w:b w:val="0"/>
+                <w:color w:val="55604F"/>
+                <w:sz w:val="16"/>
+                <w:u w:val="none"/>
+              </w:rPr>
+              <w:t>5</w:t>
+            </w:r>
+          </w:p>
+          <w:p>
+            <w:pPr>
+              <w:spacing w:after="0"/>
+              <w:jc w:val="center"/>
+            </w:pPr>
+            <w:r>
+              <w:rPr>
+                <w:rFonts w:ascii="Trade Gothic Next" w:hAnsi="Trade Gothic Next"/>
+                <w:b/>
+                <w:color w:val="14161B"/>
+                <w:sz w:val="18"/>
+                <w:u w:val="none"/>
+              </w:rPr>
+              <w:t>B</w:t>
+            </w:r>
+          </w:p>
         </w:tc>
         <w:tc>
           <w:tcPr>
@@ -7414,7 +7543,7 @@
                 <w:sz w:val="16"/>
                 <w:u w:val="none"/>
               </w:rPr>
-              <w:t>5</w:t>
+              <w:t>6</w:t>
             </w:r>
           </w:p>
           <w:p>
@@ -7430,7 +7559,7 @@
                 <w:sz w:val="18"/>
                 <w:u w:val="none"/>
               </w:rPr>
-              <w:t>B</w:t>
+              <w:t>C</w:t>
             </w:r>
           </w:p>
         </w:tc>
@@ -7463,7 +7592,7 @@
                 <w:sz w:val="16"/>
                 <w:u w:val="none"/>
               </w:rPr>
-              <w:t>6</w:t>
+              <w:t>7</w:t>
             </w:r>
           </w:p>
           <w:p>
@@ -7479,7 +7608,7 @@
                 <w:sz w:val="18"/>
                 <w:u w:val="none"/>
               </w:rPr>
-              <w:t>C</w:t>
+              <w:t>N</w:t>
             </w:r>
           </w:p>
         </w:tc>
@@ -7512,7 +7641,7 @@
                 <w:sz w:val="16"/>
                 <w:u w:val="none"/>
               </w:rPr>
-              <w:t>7</w:t>
+              <w:t>8</w:t>
             </w:r>
           </w:p>
           <w:p>
@@ -7528,7 +7657,7 @@
                 <w:sz w:val="18"/>
                 <w:u w:val="none"/>
               </w:rPr>
-              <w:t>N</w:t>
+              <w:t>O</w:t>
             </w:r>
           </w:p>
         </w:tc>
@@ -7561,7 +7690,7 @@
                 <w:sz w:val="16"/>
                 <w:u w:val="none"/>
               </w:rPr>
-              <w:t>8</w:t>
+              <w:t>9</w:t>
             </w:r>
           </w:p>
           <w:p>
@@ -7577,7 +7706,7 @@
                 <w:sz w:val="18"/>
                 <w:u w:val="none"/>
               </w:rPr>
-              <w:t>O</w:t>
+              <w:t>F</w:t>
             </w:r>
           </w:p>
         </w:tc>
@@ -7610,7 +7739,7 @@
                 <w:sz w:val="16"/>
                 <w:u w:val="none"/>
               </w:rPr>
-              <w:t>9</w:t>
+              <w:t>10</w:t>
             </w:r>
           </w:p>
           <w:p>
@@ -7626,7 +7755,7 @@
                 <w:sz w:val="18"/>
                 <w:u w:val="none"/>
               </w:rPr>
-              <w:t>F</w:t>
+              <w:t>Ne</w:t>
             </w:r>
           </w:p>
         </w:tc>
@@ -7733,12 +7862,6 @@
               <w:t>Mg</w:t>
             </w:r>
           </w:p>
-        </w:tc>
-        <w:tc>
-          <w:tcPr>
-            <w:tcW w:type="dxa" w:w="600"/>
-          </w:tcPr>
-          <w:p/>
         </w:tc>
         <w:tc>
           <w:tcPr>
@@ -8042,6 +8165,55 @@
                 <w:u w:val="none"/>
               </w:rPr>
               <w:t>Cl</w:t>
+            </w:r>
+          </w:p>
+        </w:tc>
+        <w:tc>
+          <w:tcPr>
+            <w:tcW w:type="dxa" w:w="600"/>
+            <w:tcMar>
+              <w:top w:w="10" w:type="dxa"/>
+              <w:left w:w="20" w:type="dxa"/>
+              <w:bottom w:w="0" w:type="dxa"/>
+              <w:right w:w="0" w:type="dxa"/>
+            </w:tcMar>
+            <w:tcBorders>
+              <w:top w:val="single" w:sz="6" w:color="C8CDC2"/>
+              <w:left w:val="single" w:sz="6" w:color="C8CDC2"/>
+              <w:bottom w:val="single" w:sz="6" w:color="C8CDC2"/>
+              <w:right w:val="single" w:sz="6" w:color="C8CDC2"/>
+            </w:tcBorders>
+            <w:vAlign w:val="top"/>
+          </w:tcPr>
+          <w:p>
+            <w:pPr>
+              <w:spacing w:after="0"/>
+            </w:pPr>
+            <w:r>
+              <w:rPr>
+                <w:rFonts w:ascii="Trade Gothic Next" w:hAnsi="Trade Gothic Next"/>
+                <w:b w:val="0"/>
+                <w:color w:val="55604F"/>
+                <w:sz w:val="16"/>
+                <w:u w:val="none"/>
+              </w:rPr>
+              <w:t>18</w:t>
+            </w:r>
+          </w:p>
+          <w:p>
+            <w:pPr>
+              <w:spacing w:after="0"/>
+              <w:jc w:val="center"/>
+            </w:pPr>
+            <w:r>
+              <w:rPr>
+                <w:rFonts w:ascii="Trade Gothic Next" w:hAnsi="Trade Gothic Next"/>
+                <w:b/>
+                <w:color w:val="14161B"/>
+                <w:sz w:val="18"/>
+                <w:u w:val="none"/>
+              </w:rPr>
+              <w:t>Ar</w:t>
             </w:r>
           </w:p>
         </w:tc>

</xml_diff>